<commit_message>
Fix overlapping legend and labels in contract-tables figures; rebuild Word manuscript
Co-Authored-By: Claude Opus 5.5 <noreply@anthropic.com>
</commit_message>
<xml_diff>
--- a/paper/manuscript.docx
+++ b/paper/manuscript.docx
@@ -7334,7 +7334,7 @@
       <w:r>
         <w:drawing>
           <wp:inline>
-            <wp:extent cx="5334000" cy="3026823"/>
+            <wp:extent cx="5334000" cy="3153539"/>
             <wp:effectExtent b="0" l="0" r="0" t="0"/>
             <wp:docPr descr="Fig. 10. Clause 1229 average tables (N_n, R_n) printed in two signed contracts compared with 1991-2020 site normals from CHIRPS and CPC, and the resulting EOT per 3-year contract." title="" id="68" name="Picture"/>
             <a:graphic>
@@ -7355,7 +7355,7 @@
                   <pic:spPr bwMode="auto">
                     <a:xfrm>
                       <a:off x="0" y="0"/>
-                      <a:ext cx="5334000" cy="3026823"/>
+                      <a:ext cx="5334000" cy="3153539"/>
                     </a:xfrm>
                     <a:prstGeom prst="rect">
                       <a:avLst/>

</xml_diff>